<commit_message>
Wire the executed ASI-Evolve run into the paper as a reproducibility artifact
- Expand the "Mitigation discovery" subsection (main.tex + the docx generator)
  from a conceptual claim to the concrete executed run: Claude Opus 4.8 proposer,
  Layer-3 PRISM oracle, converged in four rounds to rotation-only (score -0.05);
  every candidate model-checked before scoring.
- Recompile main.pdf and regenerate the Word rendition (both verified to contain
  the new text).
- Archive the run record as asi_evolve/example_run.json and document the executed
  run (result table + provenance) in asi_evolve/README.md.
</commit_message>
<xml_diff>
--- a/Docs/ValidationResults+Paper/Trivy Supply-Chain Attack - Academic Paper.docx
+++ b/Docs/ValidationResults+Paper/Trivy Supply-Chain Attack - Academic Paper.docx
@@ -4887,7 +4887,7 @@
           <w:sz w:val="20"/>
           <w:szCs w:val="20"/>
         </w:rPr>
-        <w:t xml:space="preserve">Finally, we use the verified model as a ground-truth oracle for an automated search over defender policies, scoring each candidate by its model-checked compromise probability plus an operational-cost penalty </w:t>
+        <w:t xml:space="preserve">Finally, we use the verified model as a ground-truth oracle for an automated search over defender policies. A large-language-model proposer (Claude Opus 4.8) suggests a candidate policy — a fraction f of pipelines migrated to commit-SHA pins together with a Boolean for whether the residual credential is fully rotated — and the Layer-3 PRISM propagation model scores it by its model-checked compromise probability plus an operational-cost penalty 0.30f + 0.05r </w:t>
       </w:r>
       <w:r>
         <w:rPr>
@@ -4905,7 +4905,7 @@
           <w:sz w:val="20"/>
           <w:szCs w:val="20"/>
         </w:rPr>
-        <w:t xml:space="preserve">. Maximising the score converges on complete credential rotation as the minimal-cost provably-safe policy, recovering the paper's central recommendation without human guidance. The search proposes; the model checker decides.</w:t>
+        <w:t xml:space="preserve">; no candidate is trusted on the proposer's word. In an executed run the search converged in four rounds: its first proposal, complete rotation with no pinning, was verified to drive compromise to zero at cost 0.05 (score −0.05); a later proposal of full SHA-pinning without rotation was verified safe but costlier (cost 0.30); rotation-only was returned as the optimum, recovering the paper's central recommendation without human guidance. Because the oracle is deterministic ground truth, the same minimal-cost provably-safe policy is recovered regardless of proposer stochasticity; the driver and the archived run record accompany the artifact. The search proposes; the model checker decides.</w:t>
       </w:r>
     </w:p>
     <w:p>

</xml_diff>